<commit_message>
calendar cell color updates
</commit_message>
<xml_diff>
--- a/flow/20230530_calendar/2025_Календар_g.docx
+++ b/flow/20230530_calendar/2025_Календар_g.docx
@@ -545,7 +545,6 @@
       <w:r>
         <w:rPr>
           <w:rFonts w:ascii="Times New Roman" w:hAnsi="Times New Roman"/>
-          <w:b/>
           <w:sz w:val="24"/>
         </w:rPr>
         <w:t>23 Блаженних Пратулинських мучеників: Вінкентія, Микити, Івана, Константина, Михаїла, Онуфрія, Филипа, Максима, Даниїла, Константина, Вартоломея, Луки й Ігнатія</w:t>
@@ -1233,7 +1232,6 @@
       <w:r>
         <w:rPr>
           <w:rFonts w:ascii="Times New Roman" w:hAnsi="Times New Roman"/>
-          <w:b/>
           <w:sz w:val="24"/>
         </w:rPr>
         <w:t>Блаженної Едігни</w:t>
@@ -2327,7 +2325,6 @@
       <w:r>
         <w:rPr>
           <w:rFonts w:ascii="Times New Roman" w:hAnsi="Times New Roman"/>
-          <w:b/>
           <w:sz w:val="24"/>
         </w:rPr>
         <w:t>Преподобного отця нашого Стефана, єпископа Володимирського</w:t>
@@ -2362,7 +2359,6 @@
       <w:r>
         <w:rPr>
           <w:rFonts w:ascii="Times New Roman" w:hAnsi="Times New Roman"/>
-          <w:b/>
           <w:sz w:val="24"/>
         </w:rPr>
         <w:t>Святого отця нашого Кирила, єпископа Турівського</w:t>
@@ -2895,7 +2891,6 @@
       <w:r>
         <w:rPr>
           <w:rFonts w:ascii="Times New Roman" w:hAnsi="Times New Roman"/>
-          <w:b/>
           <w:sz w:val="24"/>
         </w:rPr>
         <w:t>23 Преподобної Євфросинії Полоцької, ігумені монастиря Святого Спаса</w:t>
@@ -2921,7 +2916,6 @@
       <w:r>
         <w:rPr>
           <w:rFonts w:ascii="Times New Roman" w:hAnsi="Times New Roman"/>
-          <w:b/>
           <w:sz w:val="24"/>
         </w:rPr>
         <w:t>24 🕃 Преподобного отця нашого Микити, стовпника, переяславського чудотворця</w:t>
@@ -4049,7 +4043,6 @@
       <w:r>
         <w:rPr>
           <w:rFonts w:ascii="Times New Roman" w:hAnsi="Times New Roman"/>
-          <w:b/>
           <w:color w:val="FF4400"/>
           <w:sz w:val="24"/>
         </w:rPr>
@@ -5026,7 +5019,6 @@
       <w:r>
         <w:rPr>
           <w:rFonts w:ascii="Times New Roman" w:hAnsi="Times New Roman"/>
-          <w:b/>
           <w:sz w:val="24"/>
         </w:rPr>
         <w:t>28 Собор преподобних отців Печерських, що спочивають у дальніх печерах</w:t>
@@ -5464,7 +5456,7 @@
           <w:color w:val="FF4400"/>
           <w:sz w:val="24"/>
         </w:rPr>
-        <w:t>14 🕀 Всесвітнє Воздвиження чесного й животворного Хреста</w:t>
+        <w:t>14 🕀 Всесвітнє Воздвиження чесного й животворчого Хреста</w:t>
       </w:r>
     </w:p>
     <w:p/>
@@ -5558,7 +5550,6 @@
       <w:r>
         <w:rPr>
           <w:rFonts w:ascii="Times New Roman" w:hAnsi="Times New Roman"/>
-          <w:b/>
           <w:sz w:val="24"/>
         </w:rPr>
         <w:t>20 🕃 Святих мучеників та ісповідників – великого князя Михаїла та боярина його Теодора, чернігівських чудотворців</w:t>
@@ -5755,7 +5746,6 @@
       <w:r>
         <w:rPr>
           <w:rFonts w:ascii="Times New Roman" w:hAnsi="Times New Roman"/>
-          <w:b/>
           <w:sz w:val="24"/>
         </w:rPr>
         <w:t>Собор преподобних отців Печерських, що спочивають у ближніх печерах преподобного Антонія</w:t>
@@ -6469,7 +6459,6 @@
       <w:r>
         <w:rPr>
           <w:rFonts w:ascii="Times New Roman" w:hAnsi="Times New Roman"/>
-          <w:b/>
           <w:sz w:val="24"/>
         </w:rPr>
         <w:t>29 Переставлення преподобного отця нашого Аврамія, архимандрита, Ростовського чудотворця</w:t>
@@ -7166,7 +7155,6 @@
       <w:r>
         <w:rPr>
           <w:rFonts w:ascii="Times New Roman" w:hAnsi="Times New Roman"/>
-          <w:b/>
           <w:sz w:val="24"/>
         </w:rPr>
         <w:t>Пам’ять посвячення храму Святого великомученика Юрія, що в Києві перед воротами Святої Софії</w:t>
@@ -7547,7 +7535,6 @@
       <w:r>
         <w:rPr>
           <w:rFonts w:ascii="Times New Roman" w:hAnsi="Times New Roman"/>
-          <w:b/>
           <w:sz w:val="24"/>
         </w:rPr>
         <w:t>15 🕃 Святого отця нашого Стефана ісповідника, архиєпископа Сурозького</w:t>
@@ -7799,7 +7786,6 @@
       <w:r>
         <w:rPr>
           <w:rFonts w:ascii="Times New Roman" w:hAnsi="Times New Roman"/>
-          <w:b/>
           <w:color w:val="FF4400"/>
           <w:sz w:val="24"/>
         </w:rPr>

</xml_diff>

<commit_message>
fix dismissals. upload calendar
</commit_message>
<xml_diff>
--- a/flow/20230530_calendar/2025_Календар_g.docx
+++ b/flow/20230530_calendar/2025_Календар_g.docx
@@ -3689,26 +3689,127 @@
         <w:t>1 🕃 Святих безсрібників і чудотворців Косми й Дам’яна</w:t>
       </w:r>
     </w:p>
-    <w:p>
-      <w:r>
-        <w:rPr>
-          <w:rFonts w:ascii="Times New Roman" w:hAnsi="Times New Roman"/>
-          <w:i/>
+    <w:p/>
+    <w:p/>
+    <w:p>
+      <w:r>
+        <w:t>Середа</w:t>
+      </w:r>
+    </w:p>
+    <w:p>
+      <w:r>
+        <w:rPr>
+          <w:rFonts w:ascii="Times New Roman" w:hAnsi="Times New Roman"/>
           <w:color w:val="FF4400"/>
           <w:sz w:val="24"/>
         </w:rPr>
-        <w:t>Перша неділя липня:</w:t>
-      </w:r>
-    </w:p>
-    <w:p>
-      <w:r>
-        <w:rPr>
-          <w:rFonts w:ascii="Times New Roman" w:hAnsi="Times New Roman"/>
-          <w:b/>
+        <w:t>2 🕂 Положення чесної ризи Пресвятої Владичиці нашої Богородиці у Влахерні</w:t>
+      </w:r>
+    </w:p>
+    <w:p/>
+    <w:p/>
+    <w:p>
+      <w:r>
+        <w:t>Четвер</w:t>
+      </w:r>
+    </w:p>
+    <w:p>
+      <w:r>
+        <w:rPr>
+          <w:rFonts w:ascii="Times New Roman" w:hAnsi="Times New Roman"/>
+          <w:sz w:val="24"/>
+        </w:rPr>
+        <w:t>3 Святого мученика Якинта</w:t>
+      </w:r>
+    </w:p>
+    <w:p/>
+    <w:p/>
+    <w:p>
+      <w:r>
+        <w:t>П'ятниця</w:t>
+      </w:r>
+    </w:p>
+    <w:p>
+      <w:r>
+        <w:rPr>
+          <w:rFonts w:ascii="Times New Roman" w:hAnsi="Times New Roman"/>
+          <w:sz w:val="24"/>
+        </w:rPr>
+        <w:t>4 Святого отця нашого Андрія, архиєпископа Критського, єрусалимлянина</w:t>
+      </w:r>
+    </w:p>
+    <w:p>
+      <w:r>
+        <w:rPr>
+          <w:rFonts w:ascii="Times New Roman" w:hAnsi="Times New Roman"/>
+          <w:sz w:val="24"/>
+        </w:rPr>
+        <w:t>Преподобної Марти, матері святого Симеона Дивногорця</w:t>
+      </w:r>
+    </w:p>
+    <w:p/>
+    <w:p/>
+    <w:p>
+      <w:r>
+        <w:t>Субота</w:t>
+      </w:r>
+    </w:p>
+    <w:p>
+      <w:r>
+        <w:rPr>
+          <w:rFonts w:ascii="Times New Roman" w:hAnsi="Times New Roman"/>
           <w:color w:val="FF4400"/>
           <w:sz w:val="24"/>
         </w:rPr>
-        <w:t>Свято Матері Божої Неустанної Помочі</w:t>
+        <w:t>5 🕂 Преподобного отця нашого Атанасія Афонського</w:t>
+      </w:r>
+    </w:p>
+    <w:p/>
+    <w:p/>
+    <w:p>
+      <w:r>
+        <w:t>Неділя</w:t>
+      </w:r>
+    </w:p>
+    <w:p>
+      <w:r>
+        <w:rPr>
+          <w:rFonts w:ascii="Times New Roman" w:hAnsi="Times New Roman"/>
+          <w:sz w:val="24"/>
+        </w:rPr>
+        <w:t>6 Преподобного отця нашого Сисоя Великого</w:t>
+      </w:r>
+    </w:p>
+    <w:p/>
+    <w:p/>
+    <w:p>
+      <w:r>
+        <w:t>Понеділок</w:t>
+      </w:r>
+    </w:p>
+    <w:p>
+      <w:r>
+        <w:rPr>
+          <w:rFonts w:ascii="Times New Roman" w:hAnsi="Times New Roman"/>
+          <w:sz w:val="24"/>
+        </w:rPr>
+        <w:t>7 Преподобних отців наших Томи, що в Малеї, і Акакія, про якого згадує «Ліствиця»</w:t>
+      </w:r>
+    </w:p>
+    <w:p/>
+    <w:p/>
+    <w:p>
+      <w:r>
+        <w:t>Вівторок</w:t>
+      </w:r>
+    </w:p>
+    <w:p>
+      <w:r>
+        <w:rPr>
+          <w:rFonts w:ascii="Times New Roman" w:hAnsi="Times New Roman"/>
+          <w:sz w:val="24"/>
+        </w:rPr>
+        <w:t>8 🕃 Святого великомученика Прокопія</w:t>
       </w:r>
     </w:p>
     <w:p/>
@@ -3722,26 +3823,44 @@
       <w:r>
         <w:rPr>
           <w:rFonts w:ascii="Times New Roman" w:hAnsi="Times New Roman"/>
+          <w:sz w:val="24"/>
+        </w:rPr>
+        <w:t>9 Святого священномученика Панкратія, єпископа Тавроменійського</w:t>
+      </w:r>
+    </w:p>
+    <w:p/>
+    <w:p/>
+    <w:p>
+      <w:r>
+        <w:t>Четвер</w:t>
+      </w:r>
+    </w:p>
+    <w:p>
+      <w:r>
+        <w:rPr>
+          <w:rFonts w:ascii="Times New Roman" w:hAnsi="Times New Roman"/>
           <w:color w:val="FF4400"/>
           <w:sz w:val="24"/>
         </w:rPr>
-        <w:t>2 🕂 Положення чесної ризи Пресвятої Владичиці нашої Богородиці у Влахерні</w:t>
-      </w:r>
-    </w:p>
-    <w:p/>
-    <w:p/>
-    <w:p>
-      <w:r>
-        <w:t>Четвер</w:t>
-      </w:r>
-    </w:p>
-    <w:p>
-      <w:r>
-        <w:rPr>
-          <w:rFonts w:ascii="Times New Roman" w:hAnsi="Times New Roman"/>
-          <w:sz w:val="24"/>
-        </w:rPr>
-        <w:t>3 Святого мученика Якинта</w:t>
+        <w:t>10 🕂 Преподобного отця нашого Антонія Печерського, Київського</w:t>
+      </w:r>
+    </w:p>
+    <w:p>
+      <w:r>
+        <w:rPr>
+          <w:rFonts w:ascii="Times New Roman" w:hAnsi="Times New Roman"/>
+          <w:sz w:val="24"/>
+        </w:rPr>
+        <w:t>Святих сорока п’ятьох мучеників, що в Нікополі Вірменському</w:t>
+      </w:r>
+    </w:p>
+    <w:p>
+      <w:r>
+        <w:rPr>
+          <w:rFonts w:ascii="Times New Roman" w:hAnsi="Times New Roman"/>
+          <w:sz w:val="24"/>
+        </w:rPr>
+        <w:t>Святих братів-мучеників Франциска, Мутія і Рафаїла і тих, що з ними вбиті в Дамаску</w:t>
       </w:r>
     </w:p>
     <w:p/>
@@ -3755,18 +3874,19 @@
       <w:r>
         <w:rPr>
           <w:rFonts w:ascii="Times New Roman" w:hAnsi="Times New Roman"/>
-          <w:sz w:val="24"/>
-        </w:rPr>
-        <w:t>4 Святого отця нашого Андрія, архиєпископа Критського, єрусалимлянина</w:t>
-      </w:r>
-    </w:p>
-    <w:p>
-      <w:r>
-        <w:rPr>
-          <w:rFonts w:ascii="Times New Roman" w:hAnsi="Times New Roman"/>
-          <w:sz w:val="24"/>
-        </w:rPr>
-        <w:t>Преподобної Марти, матері святого Симеона Дивногорця</w:t>
+          <w:color w:val="FF4400"/>
+          <w:sz w:val="24"/>
+        </w:rPr>
+        <w:t>11 🕂 Переставлення блаженної Ольги, княгині Київської, у хрещенні названої Оленою</w:t>
+      </w:r>
+    </w:p>
+    <w:p>
+      <w:r>
+        <w:rPr>
+          <w:rFonts w:ascii="Times New Roman" w:hAnsi="Times New Roman"/>
+          <w:sz w:val="24"/>
+        </w:rPr>
+        <w:t>🕃 Святої мучениці і прехвальної Євфимії</w:t>
       </w:r>
     </w:p>
     <w:p/>
@@ -3780,58 +3900,94 @@
       <w:r>
         <w:rPr>
           <w:rFonts w:ascii="Times New Roman" w:hAnsi="Times New Roman"/>
+          <w:sz w:val="24"/>
+        </w:rPr>
+        <w:t>12 Святих мучеників Прокла й Іларія</w:t>
+      </w:r>
+    </w:p>
+    <w:p>
+      <w:r>
+        <w:rPr>
+          <w:rFonts w:ascii="Times New Roman" w:hAnsi="Times New Roman"/>
+          <w:sz w:val="24"/>
+        </w:rPr>
+        <w:t>Преподобного отця нашого Михаїла Малеїна</w:t>
+      </w:r>
+    </w:p>
+    <w:p/>
+    <w:p/>
+    <w:p>
+      <w:r>
+        <w:t>Неділя</w:t>
+      </w:r>
+    </w:p>
+    <w:p>
+      <w:r>
+        <w:rPr>
+          <w:rFonts w:ascii="Times New Roman" w:hAnsi="Times New Roman"/>
+          <w:sz w:val="24"/>
+        </w:rPr>
+        <w:t>13 🕃 Собор святого архангела Гавриїла</w:t>
+      </w:r>
+    </w:p>
+    <w:p>
+      <w:r>
+        <w:rPr>
+          <w:rFonts w:ascii="Times New Roman" w:hAnsi="Times New Roman"/>
+          <w:sz w:val="24"/>
+        </w:rPr>
+        <w:t>Преподобного отця нашого Стефана Савваїта</w:t>
+      </w:r>
+    </w:p>
+    <w:p>
+      <w:r>
+        <w:rPr>
+          <w:rFonts w:ascii="Times New Roman" w:hAnsi="Times New Roman"/>
+          <w:sz w:val="24"/>
+        </w:rPr>
+        <w:t>Святого отця нашого Юліана, єпископа Кеноманійського</w:t>
+      </w:r>
+    </w:p>
+    <w:p/>
+    <w:p/>
+    <w:p>
+      <w:r>
+        <w:t>Понеділок</w:t>
+      </w:r>
+    </w:p>
+    <w:p>
+      <w:r>
+        <w:rPr>
+          <w:rFonts w:ascii="Times New Roman" w:hAnsi="Times New Roman"/>
+          <w:sz w:val="24"/>
+        </w:rPr>
+        <w:t>14 🕃 Святого апостола Акили</w:t>
+      </w:r>
+    </w:p>
+    <w:p/>
+    <w:p/>
+    <w:p>
+      <w:r>
+        <w:t>Вівторок</w:t>
+      </w:r>
+    </w:p>
+    <w:p>
+      <w:r>
+        <w:rPr>
+          <w:rFonts w:ascii="Times New Roman" w:hAnsi="Times New Roman"/>
           <w:color w:val="FF4400"/>
           <w:sz w:val="24"/>
         </w:rPr>
-        <w:t>5 🕂 Преподобного отця нашого Атанасія Афонського</w:t>
-      </w:r>
-    </w:p>
-    <w:p/>
-    <w:p/>
-    <w:p>
-      <w:r>
-        <w:t>Неділя</w:t>
-      </w:r>
-    </w:p>
-    <w:p>
-      <w:r>
-        <w:rPr>
-          <w:rFonts w:ascii="Times New Roman" w:hAnsi="Times New Roman"/>
-          <w:sz w:val="24"/>
-        </w:rPr>
-        <w:t>6 Преподобного отця нашого Сисоя Великого</w:t>
-      </w:r>
-    </w:p>
-    <w:p/>
-    <w:p/>
-    <w:p>
-      <w:r>
-        <w:t>Понеділок</w:t>
-      </w:r>
-    </w:p>
-    <w:p>
-      <w:r>
-        <w:rPr>
-          <w:rFonts w:ascii="Times New Roman" w:hAnsi="Times New Roman"/>
-          <w:sz w:val="24"/>
-        </w:rPr>
-        <w:t>7 Преподобних отців наших Томи, що в Малеї, і Акакія, про якого згадує «Ліствиця»</w:t>
-      </w:r>
-    </w:p>
-    <w:p/>
-    <w:p/>
-    <w:p>
-      <w:r>
-        <w:t>Вівторок</w:t>
-      </w:r>
-    </w:p>
-    <w:p>
-      <w:r>
-        <w:rPr>
-          <w:rFonts w:ascii="Times New Roman" w:hAnsi="Times New Roman"/>
-          <w:sz w:val="24"/>
-        </w:rPr>
-        <w:t>8 🕃 Святого великомученика Прокопія</w:t>
+        <w:t>15 🕁 Святого рівноапостольного, великого князя Володимира, у святому хрещенні названого Василієм</w:t>
+      </w:r>
+    </w:p>
+    <w:p>
+      <w:r>
+        <w:rPr>
+          <w:rFonts w:ascii="Times New Roman" w:hAnsi="Times New Roman"/>
+          <w:sz w:val="24"/>
+        </w:rPr>
+        <w:t>Святих мучеників Кирика і Юліти</w:t>
       </w:r>
     </w:p>
     <w:p/>
@@ -3847,206 +4003,7 @@
           <w:rFonts w:ascii="Times New Roman" w:hAnsi="Times New Roman"/>
           <w:sz w:val="24"/>
         </w:rPr>
-        <w:t>9 Святого священномученика Панкратія, єпископа Тавроменійського</w:t>
-      </w:r>
-    </w:p>
-    <w:p/>
-    <w:p/>
-    <w:p>
-      <w:r>
-        <w:t>Четвер</w:t>
-      </w:r>
-    </w:p>
-    <w:p>
-      <w:r>
-        <w:rPr>
-          <w:rFonts w:ascii="Times New Roman" w:hAnsi="Times New Roman"/>
-          <w:color w:val="FF4400"/>
-          <w:sz w:val="24"/>
-        </w:rPr>
-        <w:t>10 🕂 Преподобного отця нашого Антонія Печерського, Київського</w:t>
-      </w:r>
-    </w:p>
-    <w:p>
-      <w:r>
-        <w:rPr>
-          <w:rFonts w:ascii="Times New Roman" w:hAnsi="Times New Roman"/>
-          <w:sz w:val="24"/>
-        </w:rPr>
-        <w:t>Святих сорока п’ятьох мучеників, що в Нікополі Вірменському</w:t>
-      </w:r>
-    </w:p>
-    <w:p>
-      <w:r>
-        <w:rPr>
-          <w:rFonts w:ascii="Times New Roman" w:hAnsi="Times New Roman"/>
-          <w:sz w:val="24"/>
-        </w:rPr>
-        <w:t>Святих братів-мучеників Франциска, Мутія і Рафаїла і тих, що з ними вбиті в Дамаску</w:t>
-      </w:r>
-    </w:p>
-    <w:p/>
-    <w:p/>
-    <w:p>
-      <w:r>
-        <w:t>П'ятниця</w:t>
-      </w:r>
-    </w:p>
-    <w:p>
-      <w:r>
-        <w:rPr>
-          <w:rFonts w:ascii="Times New Roman" w:hAnsi="Times New Roman"/>
-          <w:color w:val="FF4400"/>
-          <w:sz w:val="24"/>
-        </w:rPr>
-        <w:t>11 🕂 Переставлення блаженної Ольги, княгині Київської, у хрещенні названої Оленою</w:t>
-      </w:r>
-    </w:p>
-    <w:p>
-      <w:r>
-        <w:rPr>
-          <w:rFonts w:ascii="Times New Roman" w:hAnsi="Times New Roman"/>
-          <w:sz w:val="24"/>
-        </w:rPr>
-        <w:t>🕃 Святої мучениці і прехвальної Євфимії</w:t>
-      </w:r>
-    </w:p>
-    <w:p/>
-    <w:p/>
-    <w:p>
-      <w:r>
-        <w:t>Субота</w:t>
-      </w:r>
-    </w:p>
-    <w:p>
-      <w:r>
-        <w:rPr>
-          <w:rFonts w:ascii="Times New Roman" w:hAnsi="Times New Roman"/>
-          <w:sz w:val="24"/>
-        </w:rPr>
-        <w:t>12 Святих мучеників Прокла й Іларія</w:t>
-      </w:r>
-    </w:p>
-    <w:p>
-      <w:r>
-        <w:rPr>
-          <w:rFonts w:ascii="Times New Roman" w:hAnsi="Times New Roman"/>
-          <w:sz w:val="24"/>
-        </w:rPr>
-        <w:t>Преподобного отця нашого Михаїла Малеїна</w:t>
-      </w:r>
-    </w:p>
-    <w:p/>
-    <w:p/>
-    <w:p>
-      <w:r>
-        <w:t>Неділя</w:t>
-      </w:r>
-    </w:p>
-    <w:p>
-      <w:r>
-        <w:rPr>
-          <w:rFonts w:ascii="Times New Roman" w:hAnsi="Times New Roman"/>
-          <w:sz w:val="24"/>
-        </w:rPr>
-        <w:t>13 🕃 Собор святого архангела Гавриїла</w:t>
-      </w:r>
-    </w:p>
-    <w:p>
-      <w:r>
-        <w:rPr>
-          <w:rFonts w:ascii="Times New Roman" w:hAnsi="Times New Roman"/>
-          <w:sz w:val="24"/>
-        </w:rPr>
-        <w:t>Преподобного отця нашого Стефана Савваїта</w:t>
-      </w:r>
-    </w:p>
-    <w:p>
-      <w:r>
-        <w:rPr>
-          <w:rFonts w:ascii="Times New Roman" w:hAnsi="Times New Roman"/>
-          <w:sz w:val="24"/>
-        </w:rPr>
-        <w:t>Святого отця нашого Юліана, єпископа Кеноманійського</w:t>
-      </w:r>
-    </w:p>
-    <w:p/>
-    <w:p/>
-    <w:p>
-      <w:r>
-        <w:t>Понеділок</w:t>
-      </w:r>
-    </w:p>
-    <w:p>
-      <w:r>
-        <w:rPr>
-          <w:rFonts w:ascii="Times New Roman" w:hAnsi="Times New Roman"/>
-          <w:sz w:val="24"/>
-        </w:rPr>
-        <w:t>14 🕃 Святого апостола Акили</w:t>
-      </w:r>
-    </w:p>
-    <w:p/>
-    <w:p/>
-    <w:p>
-      <w:r>
-        <w:t>Вівторок</w:t>
-      </w:r>
-    </w:p>
-    <w:p>
-      <w:r>
-        <w:rPr>
-          <w:rFonts w:ascii="Times New Roman" w:hAnsi="Times New Roman"/>
-          <w:color w:val="FF4400"/>
-          <w:sz w:val="24"/>
-        </w:rPr>
-        <w:t>15 🕁 Святого рівноапостольного, великого князя Володимира, у святому хрещенні названого Василієм</w:t>
-      </w:r>
-    </w:p>
-    <w:p>
-      <w:r>
-        <w:rPr>
-          <w:rFonts w:ascii="Times New Roman" w:hAnsi="Times New Roman"/>
-          <w:sz w:val="24"/>
-        </w:rPr>
-        <w:t>Святих мучеників Кирика і Юліти</w:t>
-      </w:r>
-    </w:p>
-    <w:p/>
-    <w:p/>
-    <w:p>
-      <w:r>
-        <w:t>Середа</w:t>
-      </w:r>
-    </w:p>
-    <w:p>
-      <w:r>
-        <w:rPr>
-          <w:rFonts w:ascii="Times New Roman" w:hAnsi="Times New Roman"/>
-          <w:sz w:val="24"/>
-        </w:rPr>
         <w:t>16 Святого священномученика Атеногена і десятьох учнів його</w:t>
-      </w:r>
-    </w:p>
-    <w:p>
-      <w:r>
-        <w:rPr>
-          <w:rFonts w:ascii="Times New Roman" w:hAnsi="Times New Roman"/>
-          <w:i/>
-          <w:color w:val="FF4400"/>
-          <w:sz w:val="24"/>
-        </w:rPr>
-        <w:t>16 липня або найближчої неділі:</w:t>
-      </w:r>
-    </w:p>
-    <w:p>
-      <w:r>
-        <w:rPr>
-          <w:rFonts w:ascii="Times New Roman" w:hAnsi="Times New Roman"/>
-          <w:color w:val="FF4400"/>
-          <w:sz w:val="24"/>
-        </w:rPr>
-        <w:t>Пам’ять Святих Отців шести Вселенських Соборів</w:t>
       </w:r>
     </w:p>
     <w:p/>
@@ -6043,17 +6000,6 @@
         <w:t>Преподобного Теофана Начертанного, єпископа Нікейського і творця канонів</w:t>
       </w:r>
     </w:p>
-    <w:p>
-      <w:r>
-        <w:rPr>
-          <w:rFonts w:ascii="Times New Roman" w:hAnsi="Times New Roman"/>
-          <w:b/>
-          <w:color w:val="FF4400"/>
-          <w:sz w:val="24"/>
-        </w:rPr>
-        <w:t>У наступну неділю святкуємо пам’ять Святих Отців Сьомого Вселенського Собору</w:t>
-      </w:r>
-    </w:p>
     <w:p/>
     <w:p/>
     <w:p>
@@ -7431,7 +7377,7 @@
           <w:color w:val="FF4400"/>
           <w:sz w:val="24"/>
         </w:rPr>
-        <w:t>9 🕁 Непорочне Зачаття Пресвятої  Богородиці св. Анною</w:t>
+        <w:t>9 🕁 Непорочне Зачаття Пресвятої Богородиці св. Анною</w:t>
       </w:r>
     </w:p>
     <w:p/>

</xml_diff>